<commit_message>
docs: add README and .env.example
</commit_message>
<xml_diff>
--- a/docs/PRD_Simote_App.docx
+++ b/docs/PRD_Simote_App.docx
@@ -28,17 +28,7 @@
           <w:sz w:val="26"/>
           <w:szCs w:val="26"/>
         </w:rPr>
-        <w:t>Simote</w:t>
-      </w:r>
-      <w:r>
-        <w:rPr>
-          <w:b/>
-          <w:bCs/>
-          <w:color w:val="2E5BFF"/>
-          <w:sz w:val="26"/>
-          <w:szCs w:val="26"/>
-        </w:rPr>
-        <w:t xml:space="preserve"> — Aplikasi Penyimpan Catatan &amp; Kredensial Pribadi</w:t>
+        <w:t>Simote — Aplikasi Penyimpan Catatan &amp; Kredensial Pribadi</w:t>
       </w:r>
     </w:p>
     <w:tbl>
@@ -65,12 +55,6 @@
         <w:gridCol w:w="2280"/>
       </w:tblGrid>
       <w:tr>
-        <w:tblPrEx>
-          <w:tblCellMar>
-            <w:top w:w="0" w:type="dxa"/>
-            <w:bottom w:w="0" w:type="dxa"/>
-          </w:tblCellMar>
-        </w:tblPrEx>
         <w:trPr>
           <w:tblHeader/>
         </w:trPr>
@@ -200,12 +184,6 @@
         </w:tc>
       </w:tr>
       <w:tr>
-        <w:tblPrEx>
-          <w:tblCellMar>
-            <w:top w:w="0" w:type="dxa"/>
-            <w:bottom w:w="0" w:type="dxa"/>
-          </w:tblCellMar>
-        </w:tblPrEx>
         <w:tc>
           <w:tcPr>
             <w:tcW w:w="2400" w:type="dxa"/>
@@ -338,10 +316,7 @@
         <w:spacing w:after="160" w:line="300" w:lineRule="auto"/>
       </w:pPr>
       <w:r>
-        <w:t>Simote</w:t>
-      </w:r>
-      <w:r>
-        <w:t xml:space="preserve"> adalah aplikasi web sederhana untuk menyimpan catatan pribadi, termasuk data sensitif seperti kredensial SSH dan pasangan login/password (misalnya akun server, akun aplikasi internal, dan lain-lain). Aplikasi ini ditujukan untuk individu atau tim kecil (multi-user) yang membutuhkan tempat penyimpanan terpusat yang aman, mudah dicari, dan cepat diakses, tanpa kompleksitas tools enterprise password manager.</w:t>
+        <w:t>Simote adalah aplikasi web sederhana untuk menyimpan catatan pribadi, termasuk data sensitif seperti kredensial SSH dan pasangan login/password (misalnya akun server, akun aplikasi internal, dan lain-lain). Aplikasi ini ditujukan untuk individu atau tim kecil (multi-user) yang membutuhkan tempat penyimpanan terpusat yang aman, mudah dicari, dan cepat diakses, tanpa kompleksitas tools enterprise password manager.</w:t>
       </w:r>
     </w:p>
     <w:p>
@@ -379,12 +354,6 @@
         <w:gridCol w:w="9360"/>
       </w:tblGrid>
       <w:tr>
-        <w:tblPrEx>
-          <w:tblCellMar>
-            <w:top w:w="0" w:type="dxa"/>
-            <w:bottom w:w="0" w:type="dxa"/>
-          </w:tblCellMar>
-        </w:tblPrEx>
         <w:tc>
           <w:tcPr>
             <w:tcW w:w="9360" w:type="dxa"/>
@@ -578,12 +547,6 @@
         <w:gridCol w:w="2860"/>
       </w:tblGrid>
       <w:tr>
-        <w:tblPrEx>
-          <w:tblCellMar>
-            <w:top w:w="0" w:type="dxa"/>
-            <w:bottom w:w="0" w:type="dxa"/>
-          </w:tblCellMar>
-        </w:tblPrEx>
         <w:trPr>
           <w:tblHeader/>
         </w:trPr>
@@ -683,12 +646,6 @@
         </w:tc>
       </w:tr>
       <w:tr>
-        <w:tblPrEx>
-          <w:tblCellMar>
-            <w:top w:w="0" w:type="dxa"/>
-            <w:bottom w:w="0" w:type="dxa"/>
-          </w:tblCellMar>
-        </w:tblPrEx>
         <w:tc>
           <w:tcPr>
             <w:tcW w:w="3500" w:type="dxa"/>
@@ -775,12 +732,6 @@
         </w:tc>
       </w:tr>
       <w:tr>
-        <w:tblPrEx>
-          <w:tblCellMar>
-            <w:top w:w="0" w:type="dxa"/>
-            <w:bottom w:w="0" w:type="dxa"/>
-          </w:tblCellMar>
-        </w:tblPrEx>
         <w:tc>
           <w:tcPr>
             <w:tcW w:w="3500" w:type="dxa"/>
@@ -867,12 +818,6 @@
         </w:tc>
       </w:tr>
       <w:tr>
-        <w:tblPrEx>
-          <w:tblCellMar>
-            <w:top w:w="0" w:type="dxa"/>
-            <w:bottom w:w="0" w:type="dxa"/>
-          </w:tblCellMar>
-        </w:tblPrEx>
         <w:tc>
           <w:tcPr>
             <w:tcW w:w="3500" w:type="dxa"/>
@@ -959,12 +904,6 @@
         </w:tc>
       </w:tr>
       <w:tr>
-        <w:tblPrEx>
-          <w:tblCellMar>
-            <w:top w:w="0" w:type="dxa"/>
-            <w:bottom w:w="0" w:type="dxa"/>
-          </w:tblCellMar>
-        </w:tblPrEx>
         <w:tc>
           <w:tcPr>
             <w:tcW w:w="3500" w:type="dxa"/>
@@ -2203,12 +2142,6 @@
         <w:gridCol w:w="3560"/>
       </w:tblGrid>
       <w:tr>
-        <w:tblPrEx>
-          <w:tblCellMar>
-            <w:top w:w="0" w:type="dxa"/>
-            <w:bottom w:w="0" w:type="dxa"/>
-          </w:tblCellMar>
-        </w:tblPrEx>
         <w:trPr>
           <w:tblHeader/>
         </w:trPr>
@@ -2308,12 +2241,6 @@
         </w:tc>
       </w:tr>
       <w:tr>
-        <w:tblPrEx>
-          <w:tblCellMar>
-            <w:top w:w="0" w:type="dxa"/>
-            <w:bottom w:w="0" w:type="dxa"/>
-          </w:tblCellMar>
-        </w:tblPrEx>
         <w:tc>
           <w:tcPr>
             <w:tcW w:w="2300" w:type="dxa"/>
@@ -2400,12 +2327,6 @@
         </w:tc>
       </w:tr>
       <w:tr>
-        <w:tblPrEx>
-          <w:tblCellMar>
-            <w:top w:w="0" w:type="dxa"/>
-            <w:bottom w:w="0" w:type="dxa"/>
-          </w:tblCellMar>
-        </w:tblPrEx>
         <w:tc>
           <w:tcPr>
             <w:tcW w:w="2300" w:type="dxa"/>
@@ -2492,12 +2413,6 @@
         </w:tc>
       </w:tr>
       <w:tr>
-        <w:tblPrEx>
-          <w:tblCellMar>
-            <w:top w:w="0" w:type="dxa"/>
-            <w:bottom w:w="0" w:type="dxa"/>
-          </w:tblCellMar>
-        </w:tblPrEx>
         <w:tc>
           <w:tcPr>
             <w:tcW w:w="2300" w:type="dxa"/>
@@ -2584,12 +2499,6 @@
         </w:tc>
       </w:tr>
       <w:tr>
-        <w:tblPrEx>
-          <w:tblCellMar>
-            <w:top w:w="0" w:type="dxa"/>
-            <w:bottom w:w="0" w:type="dxa"/>
-          </w:tblCellMar>
-        </w:tblPrEx>
         <w:tc>
           <w:tcPr>
             <w:tcW w:w="2300" w:type="dxa"/>
@@ -2676,12 +2585,6 @@
         </w:tc>
       </w:tr>
       <w:tr>
-        <w:tblPrEx>
-          <w:tblCellMar>
-            <w:top w:w="0" w:type="dxa"/>
-            <w:bottom w:w="0" w:type="dxa"/>
-          </w:tblCellMar>
-        </w:tblPrEx>
         <w:tc>
           <w:tcPr>
             <w:tcW w:w="2300" w:type="dxa"/>
@@ -2794,12 +2697,6 @@
         <w:gridCol w:w="9360"/>
       </w:tblGrid>
       <w:tr>
-        <w:tblPrEx>
-          <w:tblCellMar>
-            <w:top w:w="0" w:type="dxa"/>
-            <w:bottom w:w="0" w:type="dxa"/>
-          </w:tblCellMar>
-        </w:tblPrEx>
         <w:tc>
           <w:tcPr>
             <w:tcW w:w="9360" w:type="dxa"/>
@@ -3278,12 +3175,6 @@
         <w:gridCol w:w="7560"/>
       </w:tblGrid>
       <w:tr>
-        <w:tblPrEx>
-          <w:tblCellMar>
-            <w:top w:w="0" w:type="dxa"/>
-            <w:bottom w:w="0" w:type="dxa"/>
-          </w:tblCellMar>
-        </w:tblPrEx>
         <w:trPr>
           <w:tblHeader/>
         </w:trPr>
@@ -3352,12 +3243,6 @@
         </w:tc>
       </w:tr>
       <w:tr>
-        <w:tblPrEx>
-          <w:tblCellMar>
-            <w:top w:w="0" w:type="dxa"/>
-            <w:bottom w:w="0" w:type="dxa"/>
-          </w:tblCellMar>
-        </w:tblPrEx>
         <w:tc>
           <w:tcPr>
             <w:tcW w:w="1800" w:type="dxa"/>
@@ -3416,12 +3301,6 @@
         </w:tc>
       </w:tr>
       <w:tr>
-        <w:tblPrEx>
-          <w:tblCellMar>
-            <w:top w:w="0" w:type="dxa"/>
-            <w:bottom w:w="0" w:type="dxa"/>
-          </w:tblCellMar>
-        </w:tblPrEx>
         <w:tc>
           <w:tcPr>
             <w:tcW w:w="1800" w:type="dxa"/>
@@ -3480,12 +3359,6 @@
         </w:tc>
       </w:tr>
       <w:tr>
-        <w:tblPrEx>
-          <w:tblCellMar>
-            <w:top w:w="0" w:type="dxa"/>
-            <w:bottom w:w="0" w:type="dxa"/>
-          </w:tblCellMar>
-        </w:tblPrEx>
         <w:tc>
           <w:tcPr>
             <w:tcW w:w="1800" w:type="dxa"/>
@@ -3544,12 +3417,6 @@
         </w:tc>
       </w:tr>
       <w:tr>
-        <w:tblPrEx>
-          <w:tblCellMar>
-            <w:top w:w="0" w:type="dxa"/>
-            <w:bottom w:w="0" w:type="dxa"/>
-          </w:tblCellMar>
-        </w:tblPrEx>
         <w:tc>
           <w:tcPr>
             <w:tcW w:w="1800" w:type="dxa"/>
@@ -3679,6 +3546,125 @@
       </w:pPr>
       <w:r>
         <w:t>Siapa yang akan mengelola VPS dan rotasi encryption key — perlu proses operasional yang jelas agar key tidak hilang (yang berarti data tidak bisa di-dekripsi).</w:t>
+      </w:r>
+    </w:p>
+    <w:p>
+      <w:pPr>
+        <w:spacing w:after="100" w:line="300" w:lineRule="auto"/>
+      </w:pPr>
+    </w:p>
+    <w:p>
+      <w:pPr>
+        <w:spacing w:after="100" w:line="300" w:lineRule="auto"/>
+        <w:rPr>
+          <w:color w:val="3B3B3B"/>
+          <w:sz w:val="20"/>
+          <w:szCs w:val="20"/>
+          <w:shd w:val="clear" w:color="auto" w:fill="F8F8F8"/>
+        </w:rPr>
+      </w:pPr>
+      <w:r>
+        <w:rPr>
+          <w:color w:val="3B3B3B"/>
+          <w:sz w:val="20"/>
+          <w:szCs w:val="20"/>
+          <w:shd w:val="clear" w:color="auto" w:fill="F8F8F8"/>
+        </w:rPr>
+        <w:t>N</w:t>
+      </w:r>
+      <w:r>
+        <w:rPr>
+          <w:color w:val="3B3B3B"/>
+          <w:sz w:val="20"/>
+          <w:szCs w:val="20"/>
+          <w:shd w:val="clear" w:color="auto" w:fill="F8F8F8"/>
+        </w:rPr>
+        <w:t xml:space="preserve">ote tambahan: </w:t>
+      </w:r>
+    </w:p>
+    <w:p>
+      <w:pPr>
+        <w:pStyle w:val="ListParagraph"/>
+        <w:numPr>
+          <w:ilvl w:val="0"/>
+          <w:numId w:val="5"/>
+        </w:numPr>
+        <w:spacing w:after="100" w:line="300" w:lineRule="auto"/>
+      </w:pPr>
+      <w:r>
+        <w:rPr>
+          <w:color w:val="3B3B3B"/>
+          <w:sz w:val="20"/>
+          <w:szCs w:val="20"/>
+          <w:shd w:val="clear" w:color="auto" w:fill="F8F8F8"/>
+        </w:rPr>
+        <w:t xml:space="preserve">tidak perlu fitur lupa </w:t>
+      </w:r>
+      <w:r>
+        <w:rPr>
+          <w:color w:val="3B3B3B"/>
+          <w:sz w:val="20"/>
+          <w:szCs w:val="20"/>
+          <w:shd w:val="clear" w:color="auto" w:fill="F8F8F8"/>
+        </w:rPr>
+        <w:t>password</w:t>
+      </w:r>
+    </w:p>
+    <w:p>
+      <w:pPr>
+        <w:pStyle w:val="ListParagraph"/>
+        <w:numPr>
+          <w:ilvl w:val="0"/>
+          <w:numId w:val="5"/>
+        </w:numPr>
+        <w:spacing w:after="100" w:line="300" w:lineRule="auto"/>
+      </w:pPr>
+      <w:r>
+        <w:rPr>
+          <w:color w:val="3B3B3B"/>
+          <w:sz w:val="20"/>
+          <w:szCs w:val="20"/>
+          <w:shd w:val="clear" w:color="auto" w:fill="F8F8F8"/>
+        </w:rPr>
+        <w:t xml:space="preserve">app ini mobile firendly </w:t>
+      </w:r>
+    </w:p>
+    <w:p>
+      <w:pPr>
+        <w:pStyle w:val="ListParagraph"/>
+        <w:numPr>
+          <w:ilvl w:val="0"/>
+          <w:numId w:val="5"/>
+        </w:numPr>
+        <w:spacing w:after="100" w:line="300" w:lineRule="auto"/>
+      </w:pPr>
+      <w:r>
+        <w:rPr>
+          <w:color w:val="3B3B3B"/>
+          <w:sz w:val="20"/>
+          <w:szCs w:val="20"/>
+          <w:shd w:val="clear" w:color="auto" w:fill="F8F8F8"/>
+        </w:rPr>
+        <w:t xml:space="preserve">ada akses admin dan user, admin bisa ganti2 passs user </w:t>
+      </w:r>
+    </w:p>
+    <w:p>
+      <w:pPr>
+        <w:pStyle w:val="ListParagraph"/>
+        <w:numPr>
+          <w:ilvl w:val="0"/>
+          <w:numId w:val="5"/>
+        </w:numPr>
+        <w:spacing w:after="100" w:line="300" w:lineRule="auto"/>
+      </w:pPr>
+      <w:r>
+        <w:rPr>
+          <w:color w:val="3B3B3B"/>
+          <w:sz w:val="20"/>
+          <w:szCs w:val="20"/>
+          <w:shd w:val="clear" w:color="auto" w:fill="F8F8F8"/>
+        </w:rPr>
+        <w:t>fitur trash, bisa simpan 30 hari, sbelum 30 hari bisa di restore</w:t>
       </w:r>
     </w:p>
     <w:sectPr>
@@ -3976,6 +3962,183 @@
     </w:lvl>
   </w:abstractNum>
   <w:abstractNum w:abstractNumId="1" w15:restartNumberingAfterBreak="0">
+    <w:nsid w:val="2C3524B4"/>
+    <w:multiLevelType w:val="hybridMultilevel"/>
+    <w:tmpl w:val="70B8E528"/>
+    <w:lvl w:ilvl="0" w:tplc="0409000F">
+      <w:start w:val="1"/>
+      <w:numFmt w:val="decimal"/>
+      <w:lvlText w:val="%1."/>
+      <w:lvlJc w:val="left"/>
+      <w:pPr>
+        <w:ind w:left="720" w:hanging="360"/>
+      </w:pPr>
+    </w:lvl>
+    <w:lvl w:ilvl="1" w:tplc="04090019" w:tentative="1">
+      <w:start w:val="1"/>
+      <w:numFmt w:val="lowerLetter"/>
+      <w:lvlText w:val="%2."/>
+      <w:lvlJc w:val="left"/>
+      <w:pPr>
+        <w:ind w:left="1440" w:hanging="360"/>
+      </w:pPr>
+    </w:lvl>
+    <w:lvl w:ilvl="2" w:tplc="0409001B" w:tentative="1">
+      <w:start w:val="1"/>
+      <w:numFmt w:val="lowerRoman"/>
+      <w:lvlText w:val="%3."/>
+      <w:lvlJc w:val="right"/>
+      <w:pPr>
+        <w:ind w:left="2160" w:hanging="180"/>
+      </w:pPr>
+    </w:lvl>
+    <w:lvl w:ilvl="3" w:tplc="0409000F" w:tentative="1">
+      <w:start w:val="1"/>
+      <w:numFmt w:val="decimal"/>
+      <w:lvlText w:val="%4."/>
+      <w:lvlJc w:val="left"/>
+      <w:pPr>
+        <w:ind w:left="2880" w:hanging="360"/>
+      </w:pPr>
+    </w:lvl>
+    <w:lvl w:ilvl="4" w:tplc="04090019" w:tentative="1">
+      <w:start w:val="1"/>
+      <w:numFmt w:val="lowerLetter"/>
+      <w:lvlText w:val="%5."/>
+      <w:lvlJc w:val="left"/>
+      <w:pPr>
+        <w:ind w:left="3600" w:hanging="360"/>
+      </w:pPr>
+    </w:lvl>
+    <w:lvl w:ilvl="5" w:tplc="0409001B" w:tentative="1">
+      <w:start w:val="1"/>
+      <w:numFmt w:val="lowerRoman"/>
+      <w:lvlText w:val="%6."/>
+      <w:lvlJc w:val="right"/>
+      <w:pPr>
+        <w:ind w:left="4320" w:hanging="180"/>
+      </w:pPr>
+    </w:lvl>
+    <w:lvl w:ilvl="6" w:tplc="0409000F" w:tentative="1">
+      <w:start w:val="1"/>
+      <w:numFmt w:val="decimal"/>
+      <w:lvlText w:val="%7."/>
+      <w:lvlJc w:val="left"/>
+      <w:pPr>
+        <w:ind w:left="5040" w:hanging="360"/>
+      </w:pPr>
+    </w:lvl>
+    <w:lvl w:ilvl="7" w:tplc="04090019" w:tentative="1">
+      <w:start w:val="1"/>
+      <w:numFmt w:val="lowerLetter"/>
+      <w:lvlText w:val="%8."/>
+      <w:lvlJc w:val="left"/>
+      <w:pPr>
+        <w:ind w:left="5760" w:hanging="360"/>
+      </w:pPr>
+    </w:lvl>
+    <w:lvl w:ilvl="8" w:tplc="0409001B" w:tentative="1">
+      <w:start w:val="1"/>
+      <w:numFmt w:val="lowerRoman"/>
+      <w:lvlText w:val="%9."/>
+      <w:lvlJc w:val="right"/>
+      <w:pPr>
+        <w:ind w:left="6480" w:hanging="180"/>
+      </w:pPr>
+    </w:lvl>
+  </w:abstractNum>
+  <w:abstractNum w:abstractNumId="2" w15:restartNumberingAfterBreak="0">
+    <w:nsid w:val="48D01922"/>
+    <w:multiLevelType w:val="hybridMultilevel"/>
+    <w:tmpl w:val="FC76E9D4"/>
+    <w:lvl w:ilvl="0" w:tplc="B4CC8A6C">
+      <w:start w:val="1"/>
+      <w:numFmt w:val="decimal"/>
+      <w:lvlText w:val="%1."/>
+      <w:lvlJc w:val="left"/>
+      <w:pPr>
+        <w:ind w:left="720" w:hanging="360"/>
+      </w:pPr>
+      <w:rPr>
+        <w:rFonts w:hint="default"/>
+        <w:color w:val="3B3B3B"/>
+        <w:sz w:val="20"/>
+      </w:rPr>
+    </w:lvl>
+    <w:lvl w:ilvl="1" w:tplc="04090019" w:tentative="1">
+      <w:start w:val="1"/>
+      <w:numFmt w:val="lowerLetter"/>
+      <w:lvlText w:val="%2."/>
+      <w:lvlJc w:val="left"/>
+      <w:pPr>
+        <w:ind w:left="1440" w:hanging="360"/>
+      </w:pPr>
+    </w:lvl>
+    <w:lvl w:ilvl="2" w:tplc="0409001B" w:tentative="1">
+      <w:start w:val="1"/>
+      <w:numFmt w:val="lowerRoman"/>
+      <w:lvlText w:val="%3."/>
+      <w:lvlJc w:val="right"/>
+      <w:pPr>
+        <w:ind w:left="2160" w:hanging="180"/>
+      </w:pPr>
+    </w:lvl>
+    <w:lvl w:ilvl="3" w:tplc="0409000F" w:tentative="1">
+      <w:start w:val="1"/>
+      <w:numFmt w:val="decimal"/>
+      <w:lvlText w:val="%4."/>
+      <w:lvlJc w:val="left"/>
+      <w:pPr>
+        <w:ind w:left="2880" w:hanging="360"/>
+      </w:pPr>
+    </w:lvl>
+    <w:lvl w:ilvl="4" w:tplc="04090019" w:tentative="1">
+      <w:start w:val="1"/>
+      <w:numFmt w:val="lowerLetter"/>
+      <w:lvlText w:val="%5."/>
+      <w:lvlJc w:val="left"/>
+      <w:pPr>
+        <w:ind w:left="3600" w:hanging="360"/>
+      </w:pPr>
+    </w:lvl>
+    <w:lvl w:ilvl="5" w:tplc="0409001B" w:tentative="1">
+      <w:start w:val="1"/>
+      <w:numFmt w:val="lowerRoman"/>
+      <w:lvlText w:val="%6."/>
+      <w:lvlJc w:val="right"/>
+      <w:pPr>
+        <w:ind w:left="4320" w:hanging="180"/>
+      </w:pPr>
+    </w:lvl>
+    <w:lvl w:ilvl="6" w:tplc="0409000F" w:tentative="1">
+      <w:start w:val="1"/>
+      <w:numFmt w:val="decimal"/>
+      <w:lvlText w:val="%7."/>
+      <w:lvlJc w:val="left"/>
+      <w:pPr>
+        <w:ind w:left="5040" w:hanging="360"/>
+      </w:pPr>
+    </w:lvl>
+    <w:lvl w:ilvl="7" w:tplc="04090019" w:tentative="1">
+      <w:start w:val="1"/>
+      <w:numFmt w:val="lowerLetter"/>
+      <w:lvlText w:val="%8."/>
+      <w:lvlJc w:val="left"/>
+      <w:pPr>
+        <w:ind w:left="5760" w:hanging="360"/>
+      </w:pPr>
+    </w:lvl>
+    <w:lvl w:ilvl="8" w:tplc="0409001B" w:tentative="1">
+      <w:start w:val="1"/>
+      <w:numFmt w:val="lowerRoman"/>
+      <w:lvlText w:val="%9."/>
+      <w:lvlJc w:val="right"/>
+      <w:pPr>
+        <w:ind w:left="6480" w:hanging="180"/>
+      </w:pPr>
+    </w:lvl>
+  </w:abstractNum>
+  <w:abstractNum w:abstractNumId="3" w15:restartNumberingAfterBreak="0">
     <w:nsid w:val="5263768B"/>
     <w:multiLevelType w:val="hybridMultilevel"/>
     <w:tmpl w:val="0F209618"/>
@@ -4033,7 +4196,7 @@
       <w:lvlJc w:val="left"/>
     </w:lvl>
   </w:abstractNum>
-  <w:abstractNum w:abstractNumId="2" w15:restartNumberingAfterBreak="0">
+  <w:abstractNum w:abstractNumId="4" w15:restartNumberingAfterBreak="0">
     <w:nsid w:val="66B621B3"/>
     <w:multiLevelType w:val="hybridMultilevel"/>
     <w:tmpl w:val="EEEEB302"/>
@@ -4094,16 +4257,22 @@
     </w:lvlOverride>
   </w:num>
   <w:num w:numId="2" w16cid:durableId="1080908749">
-    <w:abstractNumId w:val="1"/>
+    <w:abstractNumId w:val="3"/>
     <w:lvlOverride w:ilvl="0">
       <w:startOverride w:val="1"/>
     </w:lvlOverride>
   </w:num>
   <w:num w:numId="3" w16cid:durableId="764306900">
-    <w:abstractNumId w:val="2"/>
+    <w:abstractNumId w:val="4"/>
     <w:lvlOverride w:ilvl="0">
       <w:startOverride w:val="1"/>
     </w:lvlOverride>
+  </w:num>
+  <w:num w:numId="4" w16cid:durableId="554243173">
+    <w:abstractNumId w:val="1"/>
+  </w:num>
+  <w:num w:numId="5" w16cid:durableId="533808334">
+    <w:abstractNumId w:val="2"/>
   </w:num>
 </w:numbering>
 </file>

</xml_diff>